<commit_message>
adopts JP's party/attorney data model
</commit_message>
<xml_diff>
--- a/docassemble/MATCMotionToAmend/data/templates/motion_to_amend.docx
+++ b/docassemble/MATCMotionToAmend/data/templates/motion_to_amend.docx
@@ -133,7 +133,7 @@
         <w:rPr>
           <w:sz w:val="24"/>
         </w:rPr>
-        <w:t>{{ users[0] }}</w:t>
+        <w:t>{{ users[plaintiff_index] }}</w:t>
       </w:r>
     </w:p>
     <w:p>
@@ -244,7 +244,7 @@
         <w:rPr>
           <w:sz w:val="24"/>
         </w:rPr>
-        <w:t>{{ other_parties[0] }}</w:t>
+        <w:t>{{ users[defendant_index] }}</w:t>
       </w:r>
     </w:p>
     <w:p>
@@ -267,19 +267,7 @@
         <w:rPr>
           <w:sz w:val="24"/>
         </w:rPr>
-        <w:t xml:space="preserve">Now comes the plaintiff, </w:t>
-      </w:r>
-      <w:r>
-        <w:rPr>
-          <w:sz w:val="24"/>
-        </w:rPr>
-        <w:t>{{ users[0] }}</w:t>
-      </w:r>
-      <w:r>
-        <w:rPr>
-          <w:sz w:val="24"/>
-        </w:rPr>
-        <w:t xml:space="preserve"> and moves this Honorable Court for leave to amend paragraph five (5) of his/her Complaint for Divorce to read as follows:</w:t>
+        <w:t xml:space="preserve">Now comes the plaintiff, {{ users[plaintiff_index] }} and moves this Honorable Court for leave to amend paragraph five (5) of his/her Complaint for Divorce to read as follows:</w:t>
       </w:r>
     </w:p>
     <w:p>
@@ -291,31 +279,7 @@
         <w:rPr>
           <w:sz w:val="24"/>
         </w:rPr>
-        <w:t xml:space="preserve">5.  On or about </w:t>
-      </w:r>
-      <w:r>
-        <w:rPr>
-          <w:sz w:val="24"/>
-        </w:rPr>
-        <w:t>{{ breakdown_date }}</w:t>
-      </w:r>
-      <w:r>
-        <w:rPr>
-          <w:sz w:val="24"/>
-        </w:rPr>
-        <w:t xml:space="preserve"> at </w:t>
-      </w:r>
-      <w:r>
-        <w:rPr>
-          <w:sz w:val="24"/>
-        </w:rPr>
-        <w:t>{{ breakdown_location }}</w:t>
-      </w:r>
-      <w:r>
-        <w:rPr>
-          <w:sz w:val="24"/>
-        </w:rPr>
-        <w:t xml:space="preserve"> there was an irretrievable breakdown of the marriage, which has continued to this date.  Plaintiff files this complaint under the provisions of </w:t>
+        <w:t xml:space="preserve">5.  On or about {{ marriage_breakdown_date }} at {{ breakdown_location }} there was an irretrievable breakdown of the marriage, which has continued to this date.  Plaintiff files this complaint under the provisions of </w:t>
       </w:r>
       <w:r>
         <w:rPr>
@@ -341,19 +305,7 @@
         <w:rPr>
           <w:sz w:val="24"/>
         </w:rPr>
-        <w:t xml:space="preserve">The plaintiff further moves that the Court permit the filing of the notarized Separation Agreement and Affidavits of Irretrievable Breakdown after ninety (90) days, if applicable, from the commencement of this action on the ground that this action was commenced on </w:t>
-      </w:r>
-      <w:r>
-        <w:rPr>
-          <w:sz w:val="24"/>
-        </w:rPr>
-        <w:t>{{ action_commenced_date }}</w:t>
-      </w:r>
-      <w:r>
-        <w:rPr>
-          <w:sz w:val="24"/>
-        </w:rPr>
-        <w:t>, and the parties had not reached a settlement.</w:t>
+        <w:t xml:space="preserve">The plaintiff further moves that the Court permit the filing of the notarized Separation Agreement and Affidavits of Irretrievable Breakdown after ninety (90) days, if applicable, from the commencement of this action on the ground that this action was commenced on {{ action_commenced_date }}, and the parties had not reached a settlement.</w:t>
       </w:r>
     </w:p>
     <w:p>
@@ -409,7 +361,7 @@
               <w:spacing w:before="0" w:after="0"/>
             </w:pPr>
             <w:r>
-              <w:t>{%p if plaintiff_has_attorney %}</w:t>
+              <w:t>{%p if users[plaintiff_index].has_attorney %}</w:t>
             </w:r>
           </w:p>
           <w:p>
@@ -448,7 +400,7 @@
               <w:rPr>
                 <w:sz w:val="24"/>
               </w:rPr>
-              <w:t>{{ attorney_name }}</w:t>
+              <w:t>{{ attorneys[plaintiff_index] }}</w:t>
             </w:r>
           </w:p>
           <w:p>
@@ -462,7 +414,7 @@
               <w:rPr>
                 <w:sz w:val="24"/>
               </w:rPr>
-              <w:t>{{ attorney_address_line1 }}</w:t>
+              <w:t>{{ attorneys[plaintiff_index].address.address }}</w:t>
             </w:r>
           </w:p>
           <w:p>
@@ -476,7 +428,7 @@
               <w:rPr>
                 <w:sz w:val="24"/>
               </w:rPr>
-              <w:t>{{ attorney_address_line2 }}</w:t>
+              <w:t>{{ attorneys[plaintiff_index].address.city }}, {{ attorneys[plaintiff_index].address.state }} {{ attorneys[plaintiff_index].address.zip }}</w:t>
             </w:r>
           </w:p>
           <w:p>
@@ -487,13 +439,7 @@
               <w:rPr>
                 <w:sz w:val="24"/>
               </w:rPr>
-              <w:t xml:space="preserve">Phone: </w:t>
-            </w:r>
-            <w:r>
-              <w:rPr>
-                <w:sz w:val="24"/>
-              </w:rPr>
-              <w:t>{{ attorney_phone }}</w:t>
+              <w:t xml:space="preserve">Phone: {{ attorneys[plaintiff_index].phone_number }}</w:t>
             </w:r>
           </w:p>
           <w:p>
@@ -526,7 +472,7 @@
               <w:rPr>
                 <w:sz w:val="24"/>
               </w:rPr>
-              <w:t>{{ users[0].signature }}</w:t>
+              <w:t>{{ users[plaintiff_index].signature }}</w:t>
             </w:r>
           </w:p>
           <w:p>
@@ -540,7 +486,7 @@
               <w:rPr>
                 <w:sz w:val="24"/>
               </w:rPr>
-              <w:t>{{ users[0] }}</w:t>
+              <w:t>{{ users[plaintiff_index] }}</w:t>
             </w:r>
           </w:p>
           <w:p>
@@ -554,7 +500,7 @@
               <w:rPr>
                 <w:sz w:val="24"/>
               </w:rPr>
-              <w:t>{{ users[0].address.address }}</w:t>
+              <w:t>{{ users[plaintiff_index].address.address }}</w:t>
             </w:r>
           </w:p>
           <w:p>
@@ -568,7 +514,7 @@
               <w:rPr>
                 <w:sz w:val="24"/>
               </w:rPr>
-              <w:t>{{ users[0].address.city }}, {{ users[0].address.state }} {{ users[0].address.zip }}</w:t>
+              <w:t>{{ users[plaintiff_index].address.city }}, {{ users[plaintiff_index].address.state }} {{ users[plaintiff_index].address.zip }}</w:t>
             </w:r>
           </w:p>
           <w:p>
@@ -579,13 +525,7 @@
               <w:rPr>
                 <w:sz w:val="24"/>
               </w:rPr>
-              <w:t xml:space="preserve">Phone: </w:t>
-            </w:r>
-            <w:r>
-              <w:rPr>
-                <w:sz w:val="24"/>
-              </w:rPr>
-              <w:t>{{ users[0].phone_number }}</w:t>
+              <w:t xml:space="preserve">Phone: {{ users[plaintiff_index].phone_number }}</w:t>
             </w:r>
           </w:p>
           <w:p>
@@ -620,7 +560,7 @@
         <w:spacing w:before="0" w:after="0"/>
       </w:pPr>
       <w:r>
-        <w:t>{%p if defendant_has_attorney %}</w:t>
+        <w:t>{%p if users[defendant_index].has_attorney %}</w:t>
       </w:r>
     </w:p>
     <w:p>
@@ -635,7 +575,7 @@
         <w:rPr>
           <w:sz w:val="24"/>
         </w:rPr>
-        <w:t>{{ assenting_attorney_signature }}</w:t>
+        <w:t>{{ attorneys[defendant_index].signature }}</w:t>
       </w:r>
     </w:p>
     <w:p>
@@ -650,7 +590,7 @@
         <w:rPr>
           <w:sz w:val="24"/>
         </w:rPr>
-        <w:t>{{ assenting_party_name }}</w:t>
+        <w:t>{{ attorneys[defendant_index] }}</w:t>
       </w:r>
     </w:p>
     <w:p>
@@ -665,7 +605,7 @@
         <w:rPr>
           <w:sz w:val="24"/>
         </w:rPr>
-        <w:t>{{ assenting_party_address_line1 }}</w:t>
+        <w:t>{{ attorneys[defendant_index].address.address }}</w:t>
       </w:r>
     </w:p>
     <w:p>
@@ -680,7 +620,7 @@
         <w:rPr>
           <w:sz w:val="24"/>
         </w:rPr>
-        <w:t>{{ assenting_party_address_line2 }}</w:t>
+        <w:t>{{ attorneys[defendant_index].address.city }}, {{ attorneys[defendant_index].address.state }} {{ attorneys[defendant_index].address.zip }}</w:t>
       </w:r>
     </w:p>
     <w:p>
@@ -691,13 +631,7 @@
         <w:rPr>
           <w:sz w:val="24"/>
         </w:rPr>
-        <w:t xml:space="preserve">Phone: </w:t>
-      </w:r>
-      <w:r>
-        <w:rPr>
-          <w:sz w:val="24"/>
-        </w:rPr>
-        <w:t>{{ assenting_party_phone }}</w:t>
+        <w:t xml:space="preserve">Phone: {{ attorneys[defendant_index].phone_number }}</w:t>
       </w:r>
     </w:p>
     <w:p>
@@ -720,7 +654,7 @@
         <w:rPr>
           <w:sz w:val="24"/>
         </w:rPr>
-        <w:t>{{ other_parties[0].signature }}</w:t>
+        <w:t>{{ users[defendant_index].signature }}</w:t>
       </w:r>
     </w:p>
     <w:p>
@@ -735,7 +669,7 @@
         <w:rPr>
           <w:sz w:val="24"/>
         </w:rPr>
-        <w:t>{{ other_parties[0] }}</w:t>
+        <w:t>{{ users[defendant_index] }}</w:t>
       </w:r>
     </w:p>
     <w:p>
@@ -750,7 +684,7 @@
         <w:rPr>
           <w:sz w:val="24"/>
         </w:rPr>
-        <w:t>{{ other_parties[0].address.address }}</w:t>
+        <w:t>{{ users[defendant_index].address.address }}</w:t>
       </w:r>
     </w:p>
     <w:p>
@@ -765,7 +699,7 @@
         <w:rPr>
           <w:sz w:val="24"/>
         </w:rPr>
-        <w:t>{{ other_parties[0].address.city }}, {{ other_parties[0].address.state }} {{ other_parties[0].address.zip }}</w:t>
+        <w:t>{{ users[defendant_index].address.city }}, {{ users[defendant_index].address.state }} {{ users[defendant_index].address.zip }}</w:t>
       </w:r>
     </w:p>
     <w:p>
@@ -776,13 +710,7 @@
         <w:rPr>
           <w:sz w:val="24"/>
         </w:rPr>
-        <w:t xml:space="preserve">Phone: </w:t>
-      </w:r>
-      <w:r>
-        <w:rPr>
-          <w:sz w:val="24"/>
-        </w:rPr>
-        <w:t>{{ other_parties[0].phone_number }}</w:t>
+        <w:t xml:space="preserve">Phone: {{ users[defendant_index].phone_number }}</w:t>
       </w:r>
     </w:p>
     <w:p>

</xml_diff>